<commit_message>
chore: record applied migration and refreshed docs
</commit_message>
<xml_diff>
--- a/docs/word/10-reporting/04-zhurnal-izmeneniy.docx
+++ b/docs/word/10-reporting/04-zhurnal-izmeneniy.docx
@@ -6205,7 +6205,197 @@
               <w:rPr>
                 <w:sz w:val="18"/>
               </w:rPr>
-              <w:t>DOCX требует пересборки</w:t>
+              <w:t>DOCX пересобран</w:t>
+            </w:r>
+          </w:p>
+        </w:tc>
+        <w:tc>
+          <w:tcPr>
+            <w:tcW w:type="dxa" w:w="1247"/>
+          </w:tcPr>
+          <w:p>
+            <w:pPr>
+              <w:spacing w:after="20"/>
+            </w:pPr>
+            <w:r>
+              <w:rPr>
+                <w:sz w:val="18"/>
+              </w:rPr>
+            </w:r>
+            <w:r>
+              <w:rPr>
+                <w:sz w:val="18"/>
+              </w:rPr>
+              <w:t>Утверждено</w:t>
+            </w:r>
+          </w:p>
+        </w:tc>
+      </w:tr>
+      <w:tr>
+        <w:tc>
+          <w:tcPr>
+            <w:tcW w:type="dxa" w:w="1247"/>
+          </w:tcPr>
+          <w:p>
+            <w:pPr>
+              <w:spacing w:after="20"/>
+            </w:pPr>
+            <w:r>
+              <w:rPr>
+                <w:sz w:val="18"/>
+              </w:rPr>
+            </w:r>
+            <w:r>
+              <w:rPr>
+                <w:sz w:val="18"/>
+              </w:rPr>
+              <w:t>31</w:t>
+            </w:r>
+          </w:p>
+        </w:tc>
+        <w:tc>
+          <w:tcPr>
+            <w:tcW w:type="dxa" w:w="1247"/>
+          </w:tcPr>
+          <w:p>
+            <w:pPr>
+              <w:spacing w:after="20"/>
+            </w:pPr>
+            <w:r>
+              <w:rPr>
+                <w:sz w:val="18"/>
+              </w:rPr>
+            </w:r>
+            <w:r>
+              <w:rPr>
+                <w:sz w:val="18"/>
+              </w:rPr>
+              <w:t>30.10.2026</w:t>
+            </w:r>
+          </w:p>
+        </w:tc>
+        <w:tc>
+          <w:tcPr>
+            <w:tcW w:type="dxa" w:w="1247"/>
+          </w:tcPr>
+          <w:p>
+            <w:pPr>
+              <w:spacing w:after="20"/>
+            </w:pPr>
+            <w:r>
+              <w:rPr>
+                <w:sz w:val="18"/>
+              </w:rPr>
+            </w:r>
+            <w:r>
+              <w:rPr>
+                <w:sz w:val="18"/>
+              </w:rPr>
+              <w:t>DevOps</w:t>
+            </w:r>
+          </w:p>
+        </w:tc>
+        <w:tc>
+          <w:tcPr>
+            <w:tcW w:type="dxa" w:w="1247"/>
+          </w:tcPr>
+          <w:p>
+            <w:pPr>
+              <w:spacing w:after="20"/>
+            </w:pPr>
+            <w:r>
+              <w:rPr>
+                <w:sz w:val="18"/>
+              </w:rPr>
+            </w:r>
+            <w:r>
+              <w:rPr>
+                <w:sz w:val="18"/>
+              </w:rPr>
+              <w:t>БД</w:t>
+            </w:r>
+          </w:p>
+        </w:tc>
+        <w:tc>
+          <w:tcPr>
+            <w:tcW w:type="dxa" w:w="1247"/>
+          </w:tcPr>
+          <w:p>
+            <w:pPr>
+              <w:spacing w:after="20"/>
+            </w:pPr>
+            <w:r>
+              <w:rPr>
+                <w:sz w:val="18"/>
+              </w:rPr>
+            </w:r>
+            <w:r>
+              <w:rPr>
+                <w:sz w:val="18"/>
+              </w:rPr>
+              <w:t xml:space="preserve">Миграция </w:t>
+            </w:r>
+            <w:r>
+              <w:rPr>
+                <w:rFonts w:ascii="Consolas" w:hAnsi="Consolas"/>
+                <w:sz w:val="18"/>
+              </w:rPr>
+              <w:t>0002</w:t>
+            </w:r>
+            <w:r>
+              <w:rPr>
+                <w:sz w:val="18"/>
+              </w:rPr>
+              <w:t xml:space="preserve"> и seed применены к пилотной PostgreSQL: 73 права, 14 сервисов, 14 активаций, 30 групп, 215 выдач</w:t>
+            </w:r>
+          </w:p>
+        </w:tc>
+        <w:tc>
+          <w:tcPr>
+            <w:tcW w:type="dxa" w:w="1247"/>
+          </w:tcPr>
+          <w:p>
+            <w:pPr>
+              <w:spacing w:after="20"/>
+            </w:pPr>
+            <w:r>
+              <w:rPr>
+                <w:sz w:val="18"/>
+              </w:rPr>
+            </w:r>
+            <w:r>
+              <w:rPr>
+                <w:sz w:val="18"/>
+              </w:rPr>
+              <w:t>Ввод групповой модели</w:t>
+            </w:r>
+          </w:p>
+        </w:tc>
+        <w:tc>
+          <w:tcPr>
+            <w:tcW w:type="dxa" w:w="1247"/>
+          </w:tcPr>
+          <w:p>
+            <w:pPr>
+              <w:spacing w:after="20"/>
+            </w:pPr>
+            <w:r>
+              <w:rPr>
+                <w:sz w:val="18"/>
+              </w:rPr>
+            </w:r>
+            <w:r>
+              <w:rPr>
+                <w:sz w:val="18"/>
+              </w:rPr>
+              <w:t xml:space="preserve">Пилот на </w:t>
+            </w:r>
+            <w:r>
+              <w:rPr>
+                <w:rFonts w:ascii="Consolas" w:hAnsi="Consolas"/>
+                <w:sz w:val="18"/>
+              </w:rPr>
+              <w:t>0002_groups_permissions_services</w:t>
             </w:r>
           </w:p>
         </w:tc>

</xml_diff>